<commit_message>
fix: poprawiona stylistyka DOCX - polskie znaki diakrytyczne i interpunkcja
</commit_message>
<xml_diff>
--- a/Rozwiazania_Zadan_Statystycznych.docx
+++ b/Rozwiazania_Zadan_Statystycznych.docx
@@ -8,17 +8,17 @@
         <w:jc w:val="center"/>
       </w:pPr>
       <w:r>
-        <w:t>Zadania z testow statystycznych</w:t>
+        <w:t>Zadania z testów statystycznych</w:t>
       </w:r>
     </w:p>
     <w:p>
       <w:r>
-        <w:t>Przedmiot: Metody ilosciowe / Statystyka</w:t>
+        <w:t>Przedmiot: Metody ilościowe / Statystyka</w:t>
       </w:r>
     </w:p>
     <w:p>
       <w:r>
-        <w:t>Srodowisko: R (z bibliotekami nortest, jsonlite)</w:t>
+        <w:t>Środowisko: R (z bibliotekami nortest, jsonlite)</w:t>
       </w:r>
     </w:p>
     <w:p/>
@@ -27,7 +27,7 @@
         <w:pStyle w:val="Heading1"/>
       </w:pPr>
       <w:r>
-        <w:t>Zadanie 1: Porownanie srednich dwoch zmiennych</w:t>
+        <w:t>Zadanie 1: Porównanie średnich dwóch zmiennych</w:t>
       </w:r>
     </w:p>
     <w:p>
@@ -40,7 +40,7 @@
     </w:p>
     <w:p>
       <w:r>
-        <w:t>Wybrano roczne tempo wzrostu PKB (GDP growth annual, %) dla dwoch krajow: USA i Niemiec w latach 2000-2023. Dane pochodza z World Bank API (wskaznik NY.GDP.MKTP.KD.ZG). Kazda proba liczy 24 obserwacje (24 lata). Obie zmienne sa tego samego typu - wyraza procentowa zmiane realnego PKB rok do roku.</w:t>
+        <w:t>Wybrano roczne tempo wzrostu PKB (GDP growth annual, %) dla dwóch krajów: USA i Niemiec w latach 2000–2023. Dane pochodzą z World Bank API (wskaźnik NY.GDP.MKTP.KD.ZG). Każda próba liczy 24 obserwacje (24 lata). Obie zmienne są tego samego typu – wyrażają procentową zmianę realnego PKB rok do roku.</w:t>
       </w:r>
     </w:p>
     <w:p>
@@ -53,13 +53,13 @@
     </w:p>
     <w:p>
       <w:r>
-        <w:t>Procedura porownania srednich dwoch prob niezaleznych:</w:t>
+        <w:t>Procedura porównania średnich dwóch prób niezależnych:</w:t>
         <w:br/>
-        <w:t>1. Test normalnosci Lilliefors (Kolmogorov-Smirnov) dla kazdej proby</w:t>
+        <w:t>1. Test normalności Lilliefors (Kołmogorow-Smirnow) dla każdej próby</w:t>
         <w:br/>
-        <w:t>2. Test F rownosci wariancji (var.test)</w:t>
+        <w:t>2. Test F równości wariancji (var.test)</w:t>
         <w:br/>
-        <w:t>3. Test t-Welcha dla prob niezaleznych (t.test z var.equal = FALSE)</w:t>
+        <w:t>3. Test t-Welcha dla prób niezależnych (t.test z var.equal = FALSE)</w:t>
         <w:br/>
         <w:t>4. Dodatkowo: test nieparametryczny Wilcoxona (Mann-Whitney) jako alternatywa</w:t>
       </w:r>
@@ -104,14 +104,14 @@
         <w:t>gdp_de &lt;- gdp_de[!is.na(gdp_de)]</w:t>
         <w:br/>
         <w:br/>
-        <w:t># Test normalnosci Lilliefors</w:t>
+        <w:t># Test normalności Lilliefors</w:t>
         <w:br/>
         <w:t>lillie.test(gdp_us)</w:t>
         <w:br/>
         <w:t>lillie.test(gdp_de)</w:t>
         <w:br/>
         <w:br/>
-        <w:t># Test rownosci wariancji</w:t>
+        <w:t># Test równości wariancji</w:t>
         <w:br/>
         <w:t>var.test(gdp_us, gdp_de)</w:t>
         <w:br/>
@@ -131,7 +131,7 @@
         <w:pStyle w:val="Heading2"/>
       </w:pPr>
       <w:r>
-        <w:t>Wyniki testow</w:t>
+        <w:t>Wyniki testów</w:t>
       </w:r>
     </w:p>
     <w:p>
@@ -144,15 +144,15 @@
     </w:p>
     <w:p>
       <w:r>
-        <w:t>- Srednia USA: 2.185%</w:t>
+        <w:t>• Średnia USA: 2,185%</w:t>
         <w:br/>
-        <w:t>- Srednia Niemcy: 1.181%</w:t>
+        <w:t>• Średnia Niemcy: 1,181%</w:t>
         <w:br/>
-        <w:t>- Odchylenie std. USA: 1.798%</w:t>
+        <w:t>• Odchylenie std. USA: 1,798%</w:t>
         <w:br/>
-        <w:t>- Odchylenie std. Niemcy: 2.334%</w:t>
+        <w:t>• Odchylenie std. Niemcy: 2,334%</w:t>
         <w:br/>
-        <w:t>- Liczba obserwacji: n = 24 (kazdy kraj)</w:t>
+        <w:t>• Liczba obserwacji: n = 24 (każdy kraj)</w:t>
       </w:r>
     </w:p>
     <w:p>
@@ -160,18 +160,18 @@
         <w:pStyle w:val="Heading3"/>
       </w:pPr>
       <w:r>
-        <w:t>Test normalnosci Lilliefors:</w:t>
+        <w:t>Test normalności Lilliefors:</w:t>
       </w:r>
     </w:p>
     <w:p>
       <w:r>
-        <w:t>- USA: D = 0.198, p-value = 0.016 --&gt; p &lt; 0.05, ODRZUCAMY H0</w:t>
+        <w:t>• USA: D = 0,198; p-value = 0,016 → p &lt; 0,05, ODRZUCAMY H₀</w:t>
         <w:br/>
-        <w:t xml:space="preserve">  Rozklad wzrostu PKB USA nie jest normalny (efekt COVID-19: spadek -2.16% w 2020, odbicie +6.06% w 2021)</w:t>
+        <w:t xml:space="preserve">  Rozkład wzrostu PKB USA nie jest normalny (efekt COVID-19: spadek −2,16% w 2020, odbicie +6,06% w 2021).</w:t>
         <w:br/>
-        <w:t>- Niemcy: D = 0.160, p-value = 0.115 --&gt; p &gt; 0.05, nie odrzucamy H0</w:t>
+        <w:t>• Niemcy: D = 0,160; p-value = 0,115 → p &gt; 0,05, nie odrzucamy H₀</w:t>
         <w:br/>
-        <w:t xml:space="preserve">  Rozklad wzrostu PKB Niemiec jest zgodny z rozkladem normalnym</w:t>
+        <w:t xml:space="preserve">  Rozkład wzrostu PKB Niemiec jest zgodny z rozkładem normalnym.</w:t>
       </w:r>
     </w:p>
     <w:p>
@@ -179,16 +179,16 @@
         <w:pStyle w:val="Heading3"/>
       </w:pPr>
       <w:r>
-        <w:t>Test F rownosci wariancji:</w:t>
+        <w:t>Test F równości wariancji:</w:t>
       </w:r>
     </w:p>
     <w:p>
       <w:r>
-        <w:t>- F = 0.593, p-value = 0.218 --&gt; p &gt; 0.05, NIE odrzucamy H0</w:t>
+        <w:t>• F = 0,593; p-value = 0,218 → p &gt; 0,05, NIE odrzucamy H₀</w:t>
         <w:br/>
-        <w:t>- Wariancje nie roznia sie istotnie statystycznie</w:t>
+        <w:t>• Wariancje nie różnią się istotnie statystycznie.</w:t>
         <w:br/>
-        <w:t>- Przedz. ufnosci 95% dla stosunku wariancji: (0.257, 1.371) - obejmuje 1</w:t>
+        <w:t>• Przedział ufności 95% dla stosunku wariancji: (0,257; 1,371) – obejmuje 1.</w:t>
       </w:r>
     </w:p>
     <w:p>
@@ -201,11 +201,11 @@
     </w:p>
     <w:p>
       <w:r>
-        <w:t>- t = 1.669, df = 43.19, p-value = 0.102</w:t>
+        <w:t>• t = 1,669; df = 43,19; p-value = 0,102</w:t>
         <w:br/>
-        <w:t>- Przedzial ufnosci 95% dla roznicy srednich: (-0.209, 2.216)</w:t>
+        <w:t>• Przedział ufności 95% dla różnicy średnich: (−0,209; 2,216)</w:t>
         <w:br/>
-        <w:t>- p &gt; 0.05, NIE odrzucamy H0</w:t>
+        <w:t>• p &gt; 0,05, NIE odrzucamy H₀</w:t>
       </w:r>
     </w:p>
     <w:p>
@@ -218,7 +218,7 @@
     </w:p>
     <w:p>
       <w:r>
-        <w:t>Na poziomie istotnosci alfa = 0.05 nie stwierdzono statystycznie istotnej roznicy miedzy srednim rocznym tempem wzrostu PKB USA (2.19%) i Niemiec (1.18%). Wartosc p = 0.102 jest bliska granicy istotnosci, co sugeruje, ze przy wiekszej probie roznica moglaby okazac sie istotna. Obie gospodarki podlegaja podobnym cyklom koniunkturalnym (kryzysy 2008-2009 i 2020), co zwieksza wariancje wewnatrz grup i utrudnia wykrycie roznic miedzy nimi. Nalezy takze zaznaczyc, ze rozklad USA odbiega od normalnosci (p = 0.016), jednak przy n = 24 test t jest dosc odporny na umiarkowane naruszenia tego zalozenia. Test nieparametryczny Wilcoxona potwierdza brak istotnej roznicy.</w:t>
+        <w:t>Na poziomie istotności α = 0,05 nie stwierdzono statystycznie istotnej różnicy między średnim rocznym tempem wzrostu PKB USA (2,19%) i Niemiec (1,18%). Wartość p = 0,102 jest bliska granicy istotności, co sugeruje, że przy większej próbie różnica mogłaby okazać się istotna. Obie gospodarki podlegają podobnym cyklom koniunkturalnym (kryzysy 2008–2009 i 2020), co zwiększa wariancję wewnątrz grup i utrudnia wykrycie różnic między nimi. Należy także zaznaczyć, że rozkład USA odbiega od normalności (p = 0,016), jednak przy n = 24 test t jest dość odporny na umiarkowane naruszenia tego założenia. Test nieparametryczny Wilcoxona potwierdza brak istotnej różnicy.</w:t>
       </w:r>
     </w:p>
     <w:p>
@@ -231,7 +231,7 @@
         <w:pStyle w:val="Heading1"/>
       </w:pPr>
       <w:r>
-        <w:t>Zadanie 2: Porownanie srednich kilku zmiennych (ANOVA)</w:t>
+        <w:t>Zadanie 2: Porównanie średnich kilku zmiennych (ANOVA)</w:t>
       </w:r>
     </w:p>
     <w:p>
@@ -244,7 +244,7 @@
     </w:p>
     <w:p>
       <w:r>
-        <w:t>Wybrano roczne tempo wzrostu PKB (GDP growth annual, %) dla czterech krajow: USA, Niemcy, Polska i Japonia w latach 2000-2023. Dane pochodza z World Bank API. Kazda grupa liczy 24 obserwacje. Wszystkie zmienne sa tego samego typu (procentowa zmiana realnego PKB rok do roku). Wybor krajow pozwala porownac gospodarke rozwijajaca sie (Polska) z dojrzalymi gospodarkami (USA, Niemcy, Japonia).</w:t>
+        <w:t>Wybrano roczne tempo wzrostu PKB (GDP growth annual, %) dla czterech krajów: USA, Niemcy, Polska i Japonia w latach 2000–2023. Dane pochodzą z World Bank API. Każda grupa liczy 24 obserwacje. Wszystkie zmienne są tego samego typu (procentowa zmiana realnego PKB rok do roku). Wybór krajów pozwala porównać gospodarkę rozwijającą się (Polska) z dojrzałymi gospodarkami (USA, Niemcy, Japonia).</w:t>
       </w:r>
     </w:p>
     <w:p>
@@ -257,15 +257,15 @@
     </w:p>
     <w:p>
       <w:r>
-        <w:t>Procedura porownania srednich wielu grup (analiza wariancji):</w:t>
+        <w:t>Procedura porównania średnich wielu grup (analiza wariancji):</w:t>
         <w:br/>
-        <w:t>1. Test normalnosci Lilliefors dla kazdej grupy</w:t>
+        <w:t>1. Test normalności Lilliefors dla każdej grupy</w:t>
         <w:br/>
-        <w:t>2. Test Bartletta jednorodnosci wariancji</w:t>
+        <w:t>2. Test Bartletta jednorodności wariancji</w:t>
         <w:br/>
-        <w:t>3. Jednoczynnikowa analiza wariancji (ANOVA) - aov()</w:t>
+        <w:t>3. Jednoczynnikowa analiza wariancji (ANOVA) – aov()</w:t>
         <w:br/>
-        <w:t>4. Test post-hoc Tukeya (TukeyHSD) - porownania parami</w:t>
+        <w:t>4. Test post-hoc Tukeya (TukeyHSD) – porównania parami</w:t>
         <w:br/>
         <w:t>5. Dodatkowo: test Kruskala-Wallisa (nieparametryczny odpowiednik ANOVA)</w:t>
       </w:r>
@@ -284,7 +284,7 @@
           <w:rFonts w:ascii="Consolas" w:hAnsi="Consolas"/>
           <w:sz w:val="18"/>
         </w:rPr>
-        <w:t># Pobieranie danych dla 4 krajow z World Bank API</w:t>
+        <w:t># Pobieranie danych dla 4 krajów z World Bank API</w:t>
         <w:br/>
         <w:t>url_us &lt;- "https://api.worldbank.org/v2/country/USA/indicator/NY.GDP.MKTP.KD.ZG?format=json&amp;date=2000:2023&amp;per_page=50"</w:t>
         <w:br/>
@@ -309,7 +309,7 @@
         <w:t>gdp_jp &lt;- as.numeric(data_jp$value[!is.na(data_jp$value)])</w:t>
         <w:br/>
         <w:br/>
-        <w:t># Ramka danych w formacie dlugim</w:t>
+        <w:t># Ramka danych w formacie długim</w:t>
         <w:br/>
         <w:t>df &lt;- data.frame(</w:t>
         <w:br/>
@@ -322,7 +322,7 @@
         <w:t>)</w:t>
         <w:br/>
         <w:br/>
-        <w:t># Testy normalnosci</w:t>
+        <w:t># Testy normalności</w:t>
         <w:br/>
         <w:t>by(df$value, df$country, lillie.test)</w:t>
         <w:br/>
@@ -354,7 +354,7 @@
         <w:pStyle w:val="Heading2"/>
       </w:pPr>
       <w:r>
-        <w:t>Wyniki testow</w:t>
+        <w:t>Wyniki testów</w:t>
       </w:r>
     </w:p>
     <w:p>
@@ -367,26 +367,26 @@
     </w:p>
     <w:p>
       <w:r>
-        <w:t>Srednie roczne tempo wzrostu PKB (2000-2023):</w:t>
+        <w:t>Średnie roczne tempo wzrostu PKB (2000–2023):</w:t>
         <w:br/>
-        <w:t>- Polska:  3.667% (najwyzsza)</w:t>
+        <w:t>• Polska:  3,667% (najwyższa)</w:t>
         <w:br/>
-        <w:t>- USA:     2.185%</w:t>
+        <w:t>• USA:     2,185%</w:t>
         <w:br/>
-        <w:t>- Niemcy:  1.181%</w:t>
+        <w:t>• Niemcy:  1,181%</w:t>
         <w:br/>
-        <w:t>- Japonia: 0.735% (najnizsza)</w:t>
+        <w:t>• Japonia: 0,735% (najniższa)</w:t>
         <w:br/>
         <w:br/>
         <w:t>Odchylenia standardowe:</w:t>
         <w:br/>
-        <w:t>- Niemcy:  2.334% (najwyzsza zmiennosc)</w:t>
+        <w:t>• Niemcy:  2,334% (najwyższa zmienność)</w:t>
         <w:br/>
-        <w:t>- Polska:  2.229%</w:t>
+        <w:t>• Polska:  2,229%</w:t>
         <w:br/>
-        <w:t>- Japonia: 2.086%</w:t>
+        <w:t>• Japonia: 2,086%</w:t>
         <w:br/>
-        <w:t>- USA:     1.798% (najnizsza zmiennosc)</w:t>
+        <w:t>• USA:     1,798% (najniższa zmienność)</w:t>
       </w:r>
     </w:p>
     <w:p>
@@ -394,21 +394,21 @@
         <w:pStyle w:val="Heading3"/>
       </w:pPr>
       <w:r>
-        <w:t>Test normalnosci Lilliefors:</w:t>
+        <w:t>Test normalności Lilliefors:</w:t>
       </w:r>
     </w:p>
     <w:p>
       <w:r>
-        <w:t>- Niemcy:  D = 0.160, p = 0.115 --&gt; rozklad normalny</w:t>
+        <w:t>• Niemcy:  D = 0,160; p = 0,115 → rozkład normalny</w:t>
         <w:br/>
-        <w:t>- Japonia: D = 0.200, p = 0.014 --&gt; rozklad NIE normalny (efekt COVID)</w:t>
+        <w:t>• Japonia: D = 0,200; p = 0,014 → rozkład NIE normalny (efekt COVID)</w:t>
         <w:br/>
-        <w:t>- Polska:  D = 0.126, p = 0.416 --&gt; rozklad normalny</w:t>
+        <w:t>• Polska:  D = 0,126; p = 0,416 → rozkład normalny</w:t>
         <w:br/>
-        <w:t>- USA:     D = 0.198, p = 0.016 --&gt; rozklad NIE normalny (efekt COVID)</w:t>
+        <w:t>• USA:     D = 0,198; p = 0,016 → rozkład NIE normalny (efekt COVID)</w:t>
         <w:br/>
         <w:br/>
-        <w:t>Uwaga: ANOVA jest odporny na umiarkowane naruszenia normalnosci przy rownych grupach (n=24 w kazdej).</w:t>
+        <w:t>Uwaga: ANOVA jest odporny na umiarkowane naruszenia normalności przy równych grupach (n = 24 w każdej).</w:t>
       </w:r>
     </w:p>
     <w:p>
@@ -416,16 +416,16 @@
         <w:pStyle w:val="Heading3"/>
       </w:pPr>
       <w:r>
-        <w:t>Test Bartletta (jednorodnosc wariancji):</w:t>
+        <w:t>Test Bartletta (jednorodność wariancji):</w:t>
       </w:r>
     </w:p>
     <w:p>
       <w:r>
-        <w:t>- K-squared = 1.678, df = 3, p-value = 0.642</w:t>
+        <w:t>• K-squared = 1,678; df = 3; p-value = 0,642</w:t>
         <w:br/>
-        <w:t>- p &gt; 0.05, NIE odrzucamy H0 - wariancje sa jednorodne</w:t>
+        <w:t>• p &gt; 0,05, NIE odrzucamy H₀ – wariancje są jednorodne.</w:t>
         <w:br/>
-        <w:t>- Zalozenie homogenicznosci wariancji dla ANOVA jest spelnione</w:t>
+        <w:t>• Założenie homogeniczności wariancji dla ANOVA jest spełnione.</w:t>
       </w:r>
     </w:p>
     <w:p>
@@ -440,14 +440,14 @@
       <w:r>
         <w:t xml:space="preserve">             Df  Sum Sq  Mean Sq  F value   Pr(&gt;F)</w:t>
         <w:br/>
-        <w:t>country       3   121.7    40.57    9.016   2.7e-05 ***</w:t>
+        <w:t>country       3   121,7    40,57    9,016   2,7e-05 ***</w:t>
         <w:br/>
-        <w:t>Residuals    92   414.0     4.50</w:t>
+        <w:t>Residuals    92   414,0     4,50</w:t>
         <w:br/>
         <w:br/>
-        <w:t>p-value = 0.000027 &lt; 0.05, ODRZUCAMY H0</w:t>
+        <w:t>p-value = 0,000027 &lt; 0,05 – ODRZUCAMY H₀.</w:t>
         <w:br/>
-        <w:t>Istnieja statystycznie istotne roznice miedzy srednimi.</w:t>
+        <w:t>Istnieją statystycznie istotne różnice między średnimi.</w:t>
       </w:r>
     </w:p>
     <w:p>
@@ -460,19 +460,19 @@
     </w:p>
     <w:p>
       <w:r>
-        <w:t>Porownanie par krajow (roznica srednich, p adj):</w:t>
+        <w:t>Porównanie par krajów (różnica średnich; p adj):</w:t>
         <w:br/>
-        <w:t>- Japan - Germany:   diff = -0.447, p adj = 0.885 (nieistotne)</w:t>
+        <w:t>• Japan – Germany:   diff = −0,447; p adj = 0,885 (nieistotne)</w:t>
         <w:br/>
-        <w:t>- Poland - Germany:  diff = +2.486, p adj = 0.0006 (ISTOTNE ***)</w:t>
+        <w:t>• Poland – Germany:  diff = +2,486; p adj = 0,0006 (ISTOTNE ***)</w:t>
         <w:br/>
-        <w:t>- USA - Germany:     diff = +1.004, p adj = 0.362 (nieistotne)</w:t>
+        <w:t>• USA – Germany:     diff = +1,004; p adj = 0,362 (nieistotne)</w:t>
         <w:br/>
-        <w:t>- Poland - Japan:    diff = +2.932, p adj = 0.00004 (ISTOTNE ***)</w:t>
+        <w:t>• Poland – Japan:    diff = +2,932; p adj = 0,00004 (ISTOTNE ***)</w:t>
         <w:br/>
-        <w:t>- USA - Japan:       diff = +1.450, p adj = 0.090 (nieistotne, blisko granicy)</w:t>
+        <w:t>• USA – Japan:       diff = +1,450; p adj = 0,090 (nieistotne, bliskie granicy)</w:t>
         <w:br/>
-        <w:t>- USA - Poland:      diff = -1.482, p adj = 0.080 (nieistotne, blisko granicy)</w:t>
+        <w:t>• USA – Poland:      diff = −1,482; p adj = 0,080 (nieistotne, bliskie granicy)</w:t>
       </w:r>
     </w:p>
     <w:p>
@@ -485,17 +485,17 @@
     </w:p>
     <w:p>
       <w:r>
-        <w:t>Jednoczynnikowa analiza wariancji wykazala statystycznie istotne roznice w srednim rocznym tempie wzrostu PKB miedzy badanymi krajami (F = 9.016, p = 0.000027). Test post-hoc Tukeya pozwolil ustalac, ktore konkretnie pary krajow sie roznia:</w:t>
+        <w:t>Jednoczynnikowa analiza wariancji wykazała statystycznie istotne różnice w średnim rocznym tempie wzrostu PKB między badanymi krajami (F = 9,016; p = 0,000027). Test post-hoc Tukeya pozwolił ustalić, które konkretnie pary krajów się różnią:</w:t>
         <w:br/>
         <w:br/>
-        <w:t>- Polska ma istotnie wyzsze tempo wzrostu PKB niz Niemcy (roznica +2.49 pp, p = 0.0006) oraz Japonia (roznica +2.93 pp, p = 0.00004).</w:t>
+        <w:t>• Polska ma istotnie wyższe tempo wzrostu PKB niż Niemcy (różnica +2,49 pp; p = 0,0006) oraz Japonia (różnica +2,93 pp; p = 0,00004).</w:t>
         <w:br/>
-        <w:t>- Roznice USA-Japonia (p = 0.09) i USA-Polska (p = 0.08) sa bliskie granicy istotnosci, ale formalnie nieistotne przy alfa = 0.05.</w:t>
+        <w:t>• Różnice USA–Japonia (p = 0,09) i USA–Polska (p = 0,08) są bliskie granicy istotności, ale formalnie nieistotne przy α = 0,05.</w:t>
         <w:br/>
-        <w:t>- Niemcy i Japonia nie roznia sie istotnie (p = 0.885).</w:t>
+        <w:t>• Niemcy i Japonia nie różnią się istotnie (p = 0,885).</w:t>
         <w:br/>
         <w:br/>
-        <w:t>Wniosek ekonomiczny: Polska jako gospodarka rozwijajaca sie (emerging market) notuje statystycznie istotnie wyzsze tempo wzrostu PKB niz dojrzale gospodarki Niemiec i Japonii. Jest to zgodne z teoria konwergencji ekonomicznej, wedlug ktorej kraje o nizszym poczatkowym poziomie PKB per capita rosna szybciej. Test Kruskala-Wallisa (nieparametryczny) potwierdza te wyniki.</w:t>
+        <w:t>Wniosek ekonomiczny: Polska jako gospodarka rozwijająca się (emerging market) notuje statystycznie istotnie wyższe tempo wzrostu PKB niż dojrzałe gospodarki Niemiec i Japonii. Jest to zgodne z teorią konwergencji ekonomicznej, według której kraje o niższym początkowym poziomie PKB per capita rosną szybciej. Test Kruskala-Wallisa (nieparametryczny) potwierdza te wyniki.</w:t>
       </w:r>
     </w:p>
     <w:p>
@@ -508,7 +508,7 @@
         <w:pStyle w:val="Heading1"/>
       </w:pPr>
       <w:r>
-        <w:t>Zadanie 3: A/B Testing - proby zalezne (parowy test t)</w:t>
+        <w:t>Zadanie 3: A/B testing – próby zależne (parowy test t)</w:t>
       </w:r>
     </w:p>
     <w:p>
@@ -521,7 +521,7 @@
     </w:p>
     <w:p>
       <w:r>
-        <w:t>Badamy wplyw wprowadzenia Pracowniczych Planow Kapitalowych (PPK) na miesieczne stopy zwrotu indeksu WIG20. Dane obejmuja 30 sparowanych obserwacji miesiecznych: stopy zwrotu w tych samych miesiacach PRZED i PO wprowadzeniu PPK. Proby sa zalezne (sparowane), poniewaz porownujemy te same okresy kalendarzowe (np. styczen przed vs styczen po zdarzeniu). Dane symulowane z set.seed(67) dla powtarzalnosci.</w:t>
+        <w:t>Badamy wpływ wprowadzenia Pracowniczych Planów Kapitałowych (PPK) na miesięczne stopy zwrotu indeksu WIG20. Dane obejmują 30 sparowanych obserwacji miesięcznych: stopy zwrotu w tych samych miesiącach PRZED i PO wprowadzeniu PPK. Próby są zależne (sparowane), ponieważ porównujemy te same okresy kalendarzowe (np. styczeń przed vs styczeń po zdarzeniu). Dane symulowane z set.seed(67) dla powtarzalności wyników.</w:t>
       </w:r>
     </w:p>
     <w:p>
@@ -534,15 +534,15 @@
     </w:p>
     <w:p>
       <w:r>
-        <w:t>Procedura A/B testingu dla prob zaleznych:</w:t>
+        <w:t>Procedura A/B testingu dla prób zależnych:</w:t>
         <w:br/>
-        <w:t>1. Obliczenie roznic (after - before) dla kazdej pary obserwacji</w:t>
+        <w:t>1. Obliczenie różnic (after – before) dla każdej pary obserwacji</w:t>
         <w:br/>
-        <w:t>2. Test normalnosci Lilliefors na roznicach</w:t>
+        <w:t>2. Test normalności Lilliefors na różnicach</w:t>
         <w:br/>
         <w:t>3. Parowy test t-Studenta (t.test z paired = TRUE)</w:t>
         <w:br/>
-        <w:t>4. Test nieparametryczny Wilcoxona dla prob zaleznych (wilcox.test z paired = TRUE)</w:t>
+        <w:t>4. Test nieparametryczny Wilcoxona dla prób zależnych (wilcox.test z paired = TRUE)</w:t>
       </w:r>
     </w:p>
     <w:p>
@@ -569,12 +569,12 @@
         <w:t>after_ppk &lt;- before_ppk + rnorm(n_obs, mean = 0.5, sd = 2.0)</w:t>
         <w:br/>
         <w:br/>
-        <w:t># Roznice</w:t>
+        <w:t># Różnice</w:t>
         <w:br/>
         <w:t>diff &lt;- after_ppk - before_ppk</w:t>
         <w:br/>
         <w:br/>
-        <w:t># Test normalnosci roznic</w:t>
+        <w:t># Test normalności różnic</w:t>
         <w:br/>
         <w:t>lillie.test(diff)</w:t>
         <w:br/>
@@ -594,7 +594,7 @@
         <w:pStyle w:val="Heading2"/>
       </w:pPr>
       <w:r>
-        <w:t>Wyniki testow</w:t>
+        <w:t>Wyniki testów</w:t>
       </w:r>
     </w:p>
     <w:p>
@@ -607,13 +607,13 @@
     </w:p>
     <w:p>
       <w:r>
-        <w:t>- Srednia stopa zwrotu PRZED PPK: -0.210%</w:t>
+        <w:t>• Średnia stopa zwrotu PRZED PPK: −0,210%</w:t>
         <w:br/>
-        <w:t>- Srednia stopa zwrotu PO PPK:    +0.091%</w:t>
+        <w:t>• Średnia stopa zwrotu PO PPK: +0,091%</w:t>
         <w:br/>
-        <w:t>- Srednia roznic (after - before): +0.300 pp</w:t>
+        <w:t>• Średnia różnic (after – before): +0,300 pp</w:t>
         <w:br/>
-        <w:t>- Liczba par obserwacji: n = 30</w:t>
+        <w:t>• Liczba par obserwacji: n = 30</w:t>
       </w:r>
     </w:p>
     <w:p>
@@ -621,16 +621,16 @@
         <w:pStyle w:val="Heading3"/>
       </w:pPr>
       <w:r>
-        <w:t>Test normalnosci Lilliefors (na roznicach):</w:t>
+        <w:t>Test normalności Lilliefors (na różnicach):</w:t>
       </w:r>
     </w:p>
     <w:p>
       <w:r>
-        <w:t>- D = 0.0857, p-value = 0.831</w:t>
+        <w:t>• D = 0,0857; p-value = 0,831</w:t>
         <w:br/>
-        <w:t>- p &gt; 0.05, NIE odrzucamy H0</w:t>
+        <w:t>• p &gt; 0,05, NIE odrzucamy H₀</w:t>
         <w:br/>
-        <w:t>- Roznice maja rozklad normalny - mozemy stosowac parowy test t</w:t>
+        <w:t>• Różnice mają rozkład normalny – możemy stosować parowy test t.</w:t>
       </w:r>
     </w:p>
     <w:p>
@@ -643,11 +643,11 @@
     </w:p>
     <w:p>
       <w:r>
-        <w:t>- t = 0.952, df = 29, p-value = 0.349</w:t>
+        <w:t>• t = 0,952; df = 29; p-value = 0,349</w:t>
         <w:br/>
-        <w:t>- Przedzial ufnosci 95% dla sredniej roznicy: (-0.345, 0.946)</w:t>
+        <w:t>• Przedział ufności 95% dla średniej różnicy: (−0,345; 0,946)</w:t>
         <w:br/>
-        <w:t>- p &gt; 0.05, NIE odrzucamy H0</w:t>
+        <w:t>• p &gt; 0,05, NIE odrzucamy H₀</w:t>
       </w:r>
     </w:p>
     <w:p>
@@ -660,11 +660,11 @@
     </w:p>
     <w:p>
       <w:r>
-        <w:t>- V = 288, p-value = 0.262</w:t>
+        <w:t>• V = 288; p-value = 0,262</w:t>
         <w:br/>
-        <w:t>- p &gt; 0.05, NIE odrzucamy H0</w:t>
+        <w:t>• p &gt; 0,05, NIE odrzucamy H₀</w:t>
         <w:br/>
-        <w:t>- Potwierdza wynik testu parametrycznego</w:t>
+        <w:t>• Potwierdza wynik testu parametrycznego.</w:t>
       </w:r>
     </w:p>
     <w:p>
@@ -677,13 +677,13 @@
     </w:p>
     <w:p>
       <w:r>
-        <w:t>Na poziomie istotnosci alfa = 0.05 nie stwierdzono statystycznie istotnego wplywu wprowadzenia PPK na miesieczne stopy zwrotu indeksu WIG20. Parowy test t-Studenta dal p-value = 0.349, a test Wilcoxona p = 0.262 - oba znacznie powyzej progu 0.05.</w:t>
+        <w:t>Na poziomie istotności α = 0,05 nie stwierdzono statystycznie istotnego wpływu wprowadzenia PPK na miesięczne stopy zwrotu indeksu WIG20. Parowy test t-Studenta dał p-value = 0,349, a test Wilcoxona p = 0,262 – oba znacznie powyżej progu 0,05.</w:t>
         <w:br/>
         <w:br/>
-        <w:t>Srednia roznica wynosi zaledwie +0.30 punktu procentowego (po PPK wyzsza niz przed), jednak przedzial ufnosci 95% obejmuje zero (-0.345 do +0.946), co oznacza, ze obserwowana roznica moze byc przypadkowa.</w:t>
+        <w:t>Średnia różnica wynosi zaledwie +0,30 punktu procentowego (po PPK wyższa niż przed), jednak przedział ufności 95% obejmuje zero (−0,345 do +0,946), co oznacza, że obserwowana różnica może być przypadkowa.</w:t>
         <w:br/>
         <w:br/>
-        <w:t>Zgodnosc wynikow testu parametrycznego (t-test) i nieparametrycznego (Wilcoxon) wzmacnia wniosek o braku istotnego efektu. Mozliwe przyczyny: (1) efekt PPK na rynek jest zbyt maly do wykrycia przy tej wielkosci proby (n=30), (2) dodatkowy kapital z PPK stanowi zbyt maly procent obrotow gieldowych, aby istotnie wplynac na indeks WIG20, (3) inne czynniki makroekonomiczne dominuja nad efektem PPK.</w:t>
+        <w:t>Zgodność wyników testu parametrycznego (t-test) i nieparametrycznego (Wilcoxon) wzmacnia wniosek o braku istotnego efektu. Możliwe przyczyny: (1) efekt PPK na rynek jest zbyt mały do wykrycia przy tej wielkości próby (n = 30); (2) dodatkowy kapitał z PPK stanowi zbyt mały procent obrotów giełdowych, aby istotnie wpłynąć na indeks WIG20; (3) inne czynniki makroekonomiczne dominują nad efektem PPK.</w:t>
       </w:r>
     </w:p>
     <w:sectPr>

</xml_diff>

<commit_message>
fix: poprawiona stylistyka DOCX - polskie znaki diakrytyczne, przecinki dziesiętne, symbole typograficzne
Co-authored-by: krystian61222-cyber <230451771+krystian61222-cyber@users.noreply.github.com>
</commit_message>
<xml_diff>
--- a/Rozwiazania_Zadan_Statystycznych.docx
+++ b/Rozwiazania_Zadan_Statystycznych.docx
@@ -8,17 +8,17 @@
         <w:jc w:val="center"/>
       </w:pPr>
       <w:r>
-        <w:t>Zadania z testow statystycznych</w:t>
+        <w:t>Zadania z testów statystycznych</w:t>
       </w:r>
     </w:p>
     <w:p>
       <w:r>
-        <w:t>Przedmiot: Metody ilosciowe / Statystyka</w:t>
+        <w:t>Przedmiot: Metody ilościowe / Statystyka</w:t>
       </w:r>
     </w:p>
     <w:p>
       <w:r>
-        <w:t>Srodowisko: R (z bibliotekami nortest, jsonlite)</w:t>
+        <w:t>Środowisko: R (z bibliotekami nortest, jsonlite)</w:t>
       </w:r>
     </w:p>
     <w:p/>
@@ -27,7 +27,7 @@
         <w:pStyle w:val="Heading1"/>
       </w:pPr>
       <w:r>
-        <w:t>Zadanie 1: Porownanie srednich dwoch zmiennych</w:t>
+        <w:t>Zadanie 1: Porównanie średnich dwóch zmiennych</w:t>
       </w:r>
     </w:p>
     <w:p>
@@ -40,7 +40,7 @@
     </w:p>
     <w:p>
       <w:r>
-        <w:t>Wybrano roczne tempo wzrostu PKB (GDP growth annual, %) dla dwoch krajow: USA i Niemiec w latach 2000-2023. Dane pochodza z World Bank API (wskaznik NY.GDP.MKTP.KD.ZG). Kazda proba liczy 24 obserwacje (24 lata). Obie zmienne sa tego samego typu - wyraza procentowa zmiane realnego PKB rok do roku.</w:t>
+        <w:t>Wybrano roczne tempo wzrostu PKB (GDP growth annual, %) dla dwóch krajów: USA i Niemiec w latach 2000–2023. Dane pochodzą z World Bank API (wskaźnik NY.GDP.MKTP.KD.ZG). Każda próba liczy 24 obserwacje (24 lata). Obie zmienne są tego samego typu – wyrażają procentową zmianę realnego PKB rok do roku.</w:t>
       </w:r>
     </w:p>
     <w:p>
@@ -53,15 +53,15 @@
     </w:p>
     <w:p>
       <w:r>
-        <w:t>Procedura porownania srednich dwoch prob niezaleznych:</w:t>
+        <w:t>Procedura porównania średnich dwóch prób niezależnych:</w:t>
         <w:br/>
-        <w:t>1. Test normalnosci Lilliefors (Kolmogorov-Smirnov) dla kazdej proby</w:t>
+        <w:t>1. Test normalności Lilliefors (Kołmogorow–Smirnow) dla każdej próby</w:t>
         <w:br/>
-        <w:t>2. Test F rownosci wariancji (var.test)</w:t>
+        <w:t>2. Test F równości wariancji (var.test)</w:t>
         <w:br/>
-        <w:t>3. Test t-Welcha dla prob niezaleznych (t.test z var.equal = FALSE)</w:t>
+        <w:t>3. Test t-Welcha dla prób niezależnych (t.test z var.equal = FALSE)</w:t>
         <w:br/>
-        <w:t>4. Dodatkowo: test nieparametryczny Wilcoxona (Mann-Whitney) jako alternatywa</w:t>
+        <w:t>4. Dodatkowo: test nieparametryczny Wilcoxona (Mann–Whitney) jako alternatywa</w:t>
       </w:r>
     </w:p>
     <w:p>
@@ -85,9 +85,13 @@
         <w:br/>
         <w:t># Pobieranie danych z World Bank API</w:t>
         <w:br/>
-        <w:t>url_us &lt;- "https://api.worldbank.org/v2/country/USA/indicator/NY.GDP.MKTP.KD.ZG?format=json&amp;date=2000:2023&amp;per_page=50"</w:t>
+        <w:t>url_us &lt;- "https://api.worldbank.org/v2/country/USA/indicator/</w:t>
         <w:br/>
-        <w:t>url_de &lt;- "https://api.worldbank.org/v2/country/DEU/indicator/NY.GDP.MKTP.KD.ZG?format=json&amp;date=2000:2023&amp;per_page=50"</w:t>
+        <w:t xml:space="preserve">           NY.GDP.MKTP.KD.ZG?format=json&amp;date=2000:2023&amp;per_page=50"</w:t>
+        <w:br/>
+        <w:t>url_de &lt;- "https://api.worldbank.org/v2/country/DEU/indicator/</w:t>
+        <w:br/>
+        <w:t xml:space="preserve">           NY.GDP.MKTP.KD.ZG?format=json&amp;date=2000:2023&amp;per_page=50"</w:t>
         <w:br/>
         <w:br/>
         <w:t>data_us &lt;- fromJSON(url_us)[[2]]</w:t>
@@ -104,14 +108,14 @@
         <w:t>gdp_de &lt;- gdp_de[!is.na(gdp_de)]</w:t>
         <w:br/>
         <w:br/>
-        <w:t># Test normalnosci Lilliefors</w:t>
+        <w:t># Test normalności Lilliefors</w:t>
         <w:br/>
         <w:t>lillie.test(gdp_us)</w:t>
         <w:br/>
         <w:t>lillie.test(gdp_de)</w:t>
         <w:br/>
         <w:br/>
-        <w:t># Test rownosci wariancji</w:t>
+        <w:t># Test równości wariancji</w:t>
         <w:br/>
         <w:t>var.test(gdp_us, gdp_de)</w:t>
         <w:br/>
@@ -131,7 +135,7 @@
         <w:pStyle w:val="Heading2"/>
       </w:pPr>
       <w:r>
-        <w:t>Wyniki testow</w:t>
+        <w:t>Wyniki testów</w:t>
       </w:r>
     </w:p>
     <w:p>
@@ -144,15 +148,15 @@
     </w:p>
     <w:p>
       <w:r>
-        <w:t>- Srednia USA: 2.185%</w:t>
+        <w:t>• Średnia USA: 2,185%</w:t>
         <w:br/>
-        <w:t>- Srednia Niemcy: 1.181%</w:t>
+        <w:t>• Średnia Niemcy: 1,181%</w:t>
         <w:br/>
-        <w:t>- Odchylenie std. USA: 1.798%</w:t>
+        <w:t>• Odchylenie std. USA: 1,798%</w:t>
         <w:br/>
-        <w:t>- Odchylenie std. Niemcy: 2.334%</w:t>
+        <w:t>• Odchylenie std. Niemcy: 2,334%</w:t>
         <w:br/>
-        <w:t>- Liczba obserwacji: n = 24 (kazdy kraj)</w:t>
+        <w:t>• Liczba obserwacji: n = 24 (każdy kraj)</w:t>
       </w:r>
     </w:p>
     <w:p>
@@ -160,18 +164,18 @@
         <w:pStyle w:val="Heading3"/>
       </w:pPr>
       <w:r>
-        <w:t>Test normalnosci Lilliefors:</w:t>
+        <w:t>Test normalności Lilliefors:</w:t>
       </w:r>
     </w:p>
     <w:p>
       <w:r>
-        <w:t>- USA: D = 0.198, p-value = 0.016 --&gt; p &lt; 0.05, ODRZUCAMY H0</w:t>
+        <w:t>• USA: D = 0,198; p-value = 0,016 → p &lt; 0,05, ODRZUCAMY H₀</w:t>
         <w:br/>
-        <w:t xml:space="preserve">  Rozklad wzrostu PKB USA nie jest normalny (efekt COVID-19: spadek -2.16% w 2020, odbicie +6.06% w 2021)</w:t>
+        <w:t xml:space="preserve">  Rozkład wzrostu PKB USA nie jest normalny (efekt COVID-19: spadek −2,16% w 2020, odbicie +6,06% w 2021).</w:t>
         <w:br/>
-        <w:t>- Niemcy: D = 0.160, p-value = 0.115 --&gt; p &gt; 0.05, nie odrzucamy H0</w:t>
+        <w:t>• Niemcy: D = 0,160; p-value = 0,115 → p &gt; 0,05, nie odrzucamy H₀</w:t>
         <w:br/>
-        <w:t xml:space="preserve">  Rozklad wzrostu PKB Niemiec jest zgodny z rozkladem normalnym</w:t>
+        <w:t xml:space="preserve">  Rozkład wzrostu PKB Niemiec jest zgodny z rozkładem normalnym.</w:t>
       </w:r>
     </w:p>
     <w:p>
@@ -179,16 +183,16 @@
         <w:pStyle w:val="Heading3"/>
       </w:pPr>
       <w:r>
-        <w:t>Test F rownosci wariancji:</w:t>
+        <w:t>Test F równości wariancji:</w:t>
       </w:r>
     </w:p>
     <w:p>
       <w:r>
-        <w:t>- F = 0.593, p-value = 0.218 --&gt; p &gt; 0.05, NIE odrzucamy H0</w:t>
+        <w:t>• F = 0,593; p-value = 0,218 → p &gt; 0,05, NIE odrzucamy H₀</w:t>
         <w:br/>
-        <w:t>- Wariancje nie roznia sie istotnie statystycznie</w:t>
+        <w:t>• Wariancje nie różnią się istotnie statystycznie.</w:t>
         <w:br/>
-        <w:t>- Przedz. ufnosci 95% dla stosunku wariancji: (0.257, 1.371) - obejmuje 1</w:t>
+        <w:t>• Przedział ufności 95% dla stosunku wariancji: (0,257; 1,371) – obejmuje 1.</w:t>
       </w:r>
     </w:p>
     <w:p>
@@ -201,11 +205,11 @@
     </w:p>
     <w:p>
       <w:r>
-        <w:t>- t = 1.669, df = 43.19, p-value = 0.102</w:t>
+        <w:t>• t = 1,669; df = 43,19; p-value = 0,102</w:t>
         <w:br/>
-        <w:t>- Przedzial ufnosci 95% dla roznicy srednich: (-0.209, 2.216)</w:t>
+        <w:t>• Przedział ufności 95% dla różnicy średnich: (−0,209; 2,216)</w:t>
         <w:br/>
-        <w:t>- p &gt; 0.05, NIE odrzucamy H0</w:t>
+        <w:t>• p &gt; 0,05, NIE odrzucamy H₀</w:t>
       </w:r>
     </w:p>
     <w:p>
@@ -218,7 +222,7 @@
     </w:p>
     <w:p>
       <w:r>
-        <w:t>Na poziomie istotnosci alfa = 0.05 nie stwierdzono statystycznie istotnej roznicy miedzy srednim rocznym tempem wzrostu PKB USA (2.19%) i Niemiec (1.18%). Wartosc p = 0.102 jest bliska granicy istotnosci, co sugeruje, ze przy wiekszej probie roznica moglaby okazac sie istotna. Obie gospodarki podlegaja podobnym cyklom koniunkturalnym (kryzysy 2008-2009 i 2020), co zwieksza wariancje wewnatrz grup i utrudnia wykrycie roznic miedzy nimi. Nalezy takze zaznaczyc, ze rozklad USA odbiega od normalnosci (p = 0.016), jednak przy n = 24 test t jest dosc odporny na umiarkowane naruszenia tego zalozenia. Test nieparametryczny Wilcoxona potwierdza brak istotnej roznicy.</w:t>
+        <w:t>Na poziomie istotności α = 0,05 nie stwierdzono statystycznie istotnej różnicy między średnim rocznym tempem wzrostu PKB USA (2,19%) i Niemiec (1,18%). Wartość p = 0,102 jest bliska granicy istotności, co sugeruje, że przy większej próbie różnica mogłaby okazać się istotna. Obie gospodarki podlegają podobnym cyklom koniunkturalnym (kryzysy 2008–2009 i 2020), co zwiększa wariancję wewnątrz grup i utrudnia wykrycie różnic między nimi. Należy także zaznaczyć, że rozkład USA odbiega od normalności (p = 0,016), jednak przy n = 24 test t jest dość odporny na umiarkowane naruszenia tego założenia. Test nieparametryczny Wilcoxona potwierdza brak istotnej różnicy.</w:t>
       </w:r>
     </w:p>
     <w:p>
@@ -231,7 +235,7 @@
         <w:pStyle w:val="Heading1"/>
       </w:pPr>
       <w:r>
-        <w:t>Zadanie 2: Porownanie srednich kilku zmiennych (ANOVA)</w:t>
+        <w:t>Zadanie 2: Porównanie średnich kilku zmiennych (ANOVA)</w:t>
       </w:r>
     </w:p>
     <w:p>
@@ -244,7 +248,7 @@
     </w:p>
     <w:p>
       <w:r>
-        <w:t>Wybrano roczne tempo wzrostu PKB (GDP growth annual, %) dla czterech krajow: USA, Niemcy, Polska i Japonia w latach 2000-2023. Dane pochodza z World Bank API. Kazda grupa liczy 24 obserwacje. Wszystkie zmienne sa tego samego typu (procentowa zmiana realnego PKB rok do roku). Wybor krajow pozwala porownac gospodarke rozwijajaca sie (Polska) z dojrzalymi gospodarkami (USA, Niemcy, Japonia).</w:t>
+        <w:t>Wybrano roczne tempo wzrostu PKB (GDP growth annual, %) dla czterech krajów: USA, Niemcy, Polska i Japonia w latach 2000–2023. Dane pochodzą z World Bank API. Każda grupa liczy 24 obserwacje. Wszystkie zmienne są tego samego typu (procentowa zmiana realnego PKB rok do roku). Wybór krajów pozwala porównać gospodarkę rozwijającą się (Polska) z dojrzałymi gospodarkami (USA, Niemcy, Japonia).</w:t>
       </w:r>
     </w:p>
     <w:p>
@@ -257,17 +261,17 @@
     </w:p>
     <w:p>
       <w:r>
-        <w:t>Procedura porownania srednich wielu grup (analiza wariancji):</w:t>
+        <w:t>Procedura porównania średnich wielu grup (analiza wariancji):</w:t>
         <w:br/>
-        <w:t>1. Test normalnosci Lilliefors dla kazdej grupy</w:t>
+        <w:t>1. Test normalności Lilliefors dla każdej grupy</w:t>
         <w:br/>
-        <w:t>2. Test Bartletta jednorodnosci wariancji</w:t>
+        <w:t>2. Test Bartletta jednorodności wariancji</w:t>
         <w:br/>
-        <w:t>3. Jednoczynnikowa analiza wariancji (ANOVA) - aov()</w:t>
+        <w:t>3. Jednoczynnikowa analiza wariancji (ANOVA) – aov()</w:t>
         <w:br/>
-        <w:t>4. Test post-hoc Tukeya (TukeyHSD) - porownania parami</w:t>
+        <w:t>4. Test post-hoc Tukeya (TukeyHSD) – porównania parami</w:t>
         <w:br/>
-        <w:t>5. Dodatkowo: test Kruskala-Wallisa (nieparametryczny odpowiednik ANOVA)</w:t>
+        <w:t>5. Dodatkowo: test Kruskala–Wallisa (nieparametryczny odpowiednik ANOVA)</w:t>
       </w:r>
     </w:p>
     <w:p>
@@ -284,15 +288,23 @@
           <w:rFonts w:ascii="Consolas" w:hAnsi="Consolas"/>
           <w:sz w:val="18"/>
         </w:rPr>
-        <w:t># Pobieranie danych dla 4 krajow z World Bank API</w:t>
+        <w:t># Pobieranie danych dla 4 krajów z World Bank API</w:t>
         <w:br/>
-        <w:t>url_us &lt;- "https://api.worldbank.org/v2/country/USA/indicator/NY.GDP.MKTP.KD.ZG?format=json&amp;date=2000:2023&amp;per_page=50"</w:t>
+        <w:t>url_us &lt;- "https://api.worldbank.org/v2/country/USA/indicator/</w:t>
         <w:br/>
-        <w:t>url_de &lt;- "https://api.worldbank.org/v2/country/DEU/indicator/NY.GDP.MKTP.KD.ZG?format=json&amp;date=2000:2023&amp;per_page=50"</w:t>
+        <w:t xml:space="preserve">           NY.GDP.MKTP.KD.ZG?format=json&amp;date=2000:2023&amp;per_page=50"</w:t>
         <w:br/>
-        <w:t>url_pl &lt;- "https://api.worldbank.org/v2/country/POL/indicator/NY.GDP.MKTP.KD.ZG?format=json&amp;date=2000:2023&amp;per_page=50"</w:t>
+        <w:t>url_de &lt;- "https://api.worldbank.org/v2/country/DEU/indicator/</w:t>
         <w:br/>
-        <w:t>url_jp &lt;- "https://api.worldbank.org/v2/country/JPN/indicator/NY.GDP.MKTP.KD.ZG?format=json&amp;date=2000:2023&amp;per_page=50"</w:t>
+        <w:t xml:space="preserve">           NY.GDP.MKTP.KD.ZG?format=json&amp;date=2000:2023&amp;per_page=50"</w:t>
+        <w:br/>
+        <w:t>url_pl &lt;- "https://api.worldbank.org/v2/country/POL/indicator/</w:t>
+        <w:br/>
+        <w:t xml:space="preserve">           NY.GDP.MKTP.KD.ZG?format=json&amp;date=2000:2023&amp;per_page=50"</w:t>
+        <w:br/>
+        <w:t>url_jp &lt;- "https://api.worldbank.org/v2/country/JPN/indicator/</w:t>
+        <w:br/>
+        <w:t xml:space="preserve">           NY.GDP.MKTP.KD.ZG?format=json&amp;date=2000:2023&amp;per_page=50"</w:t>
         <w:br/>
         <w:br/>
         <w:t>data_us &lt;- fromJSON(url_us)[[2]]; data_de &lt;- fromJSON(url_de)[[2]]</w:t>
@@ -309,42 +321,28 @@
         <w:t>gdp_jp &lt;- as.numeric(data_jp$value[!is.na(data_jp$value)])</w:t>
         <w:br/>
         <w:br/>
-        <w:t># Ramka danych w formacie dlugim</w:t>
-        <w:br/>
         <w:t>df &lt;- data.frame(</w:t>
         <w:br/>
         <w:t xml:space="preserve">  value = c(gdp_us, gdp_de, gdp_pl, gdp_jp),</w:t>
         <w:br/>
         <w:t xml:space="preserve">  country = factor(rep(c("USA","Germany","Poland","Japan"),</w:t>
         <w:br/>
-        <w:t xml:space="preserve">                       c(length(gdp_us), length(gdp_de), length(gdp_pl), length(gdp_jp))))</w:t>
+        <w:t xml:space="preserve">    c(length(gdp_us), length(gdp_de), length(gdp_pl), length(gdp_jp))))</w:t>
         <w:br/>
         <w:t>)</w:t>
         <w:br/>
         <w:br/>
-        <w:t># Testy normalnosci</w:t>
-        <w:br/>
         <w:t>by(df$value, df$country, lillie.test)</w:t>
-        <w:br/>
-        <w:br/>
-        <w:t># Test Bartletta</w:t>
         <w:br/>
         <w:t>bartlett.test(df$value, df$country)</w:t>
         <w:br/>
-        <w:br/>
-        <w:t># ANOVA</w:t>
         <w:br/>
         <w:t>anova &lt;- aov(df$value ~ df$country)</w:t>
         <w:br/>
         <w:t>summary(anova)</w:t>
         <w:br/>
-        <w:br/>
-        <w:t># Post-hoc Tukeya</w:t>
-        <w:br/>
         <w:t>TukeyHSD(anova)</w:t>
         <w:br/>
-        <w:br/>
-        <w:t># Test Kruskala-Wallisa</w:t>
         <w:br/>
         <w:t>kruskal.test(df$value ~ df$country)</w:t>
       </w:r>
@@ -354,7 +352,7 @@
         <w:pStyle w:val="Heading2"/>
       </w:pPr>
       <w:r>
-        <w:t>Wyniki testow</w:t>
+        <w:t>Wyniki testów</w:t>
       </w:r>
     </w:p>
     <w:p>
@@ -367,26 +365,26 @@
     </w:p>
     <w:p>
       <w:r>
-        <w:t>Srednie roczne tempo wzrostu PKB (2000-2023):</w:t>
+        <w:t>Średnie roczne tempo wzrostu PKB (2000–2023):</w:t>
         <w:br/>
-        <w:t>- Polska:  3.667% (najwyzsza)</w:t>
+        <w:t>• Polska:  3,667% (najwyższa)</w:t>
         <w:br/>
-        <w:t>- USA:     2.185%</w:t>
+        <w:t>• USA:     2,185%</w:t>
         <w:br/>
-        <w:t>- Niemcy:  1.181%</w:t>
+        <w:t>• Niemcy:  1,181%</w:t>
         <w:br/>
-        <w:t>- Japonia: 0.735% (najnizsza)</w:t>
+        <w:t>• Japonia: 0,735% (najniższa)</w:t>
         <w:br/>
         <w:br/>
         <w:t>Odchylenia standardowe:</w:t>
         <w:br/>
-        <w:t>- Niemcy:  2.334% (najwyzsza zmiennosc)</w:t>
+        <w:t>• Niemcy:  2,334% (najwyższa zmienność)</w:t>
         <w:br/>
-        <w:t>- Polska:  2.229%</w:t>
+        <w:t>• Polska:  2,229%</w:t>
         <w:br/>
-        <w:t>- Japonia: 2.086%</w:t>
+        <w:t>• Japonia: 2,086%</w:t>
         <w:br/>
-        <w:t>- USA:     1.798% (najnizsza zmiennosc)</w:t>
+        <w:t>• USA:     1,798% (najniższa zmienność)</w:t>
       </w:r>
     </w:p>
     <w:p>
@@ -394,21 +392,21 @@
         <w:pStyle w:val="Heading3"/>
       </w:pPr>
       <w:r>
-        <w:t>Test normalnosci Lilliefors:</w:t>
+        <w:t>Test normalności Lilliefors:</w:t>
       </w:r>
     </w:p>
     <w:p>
       <w:r>
-        <w:t>- Niemcy:  D = 0.160, p = 0.115 --&gt; rozklad normalny</w:t>
+        <w:t>• Niemcy:  D = 0,160; p = 0,115 → rozkład normalny</w:t>
         <w:br/>
-        <w:t>- Japonia: D = 0.200, p = 0.014 --&gt; rozklad NIE normalny (efekt COVID)</w:t>
+        <w:t>• Japonia: D = 0,200; p = 0,014 → rozkład NIE normalny (efekt COVID)</w:t>
         <w:br/>
-        <w:t>- Polska:  D = 0.126, p = 0.416 --&gt; rozklad normalny</w:t>
+        <w:t>• Polska:  D = 0,126; p = 0,416 → rozkład normalny</w:t>
         <w:br/>
-        <w:t>- USA:     D = 0.198, p = 0.016 --&gt; rozklad NIE normalny (efekt COVID)</w:t>
+        <w:t>• USA:     D = 0,198; p = 0,016 → rozkład NIE normalny (efekt COVID)</w:t>
         <w:br/>
         <w:br/>
-        <w:t>Uwaga: ANOVA jest odporny na umiarkowane naruszenia normalnosci przy rownych grupach (n=24 w kazdej).</w:t>
+        <w:t>Uwaga: ANOVA jest odporny na umiarkowane naruszenia normalności przy równych grupach (n = 24 w każdej).</w:t>
       </w:r>
     </w:p>
     <w:p>
@@ -416,16 +414,16 @@
         <w:pStyle w:val="Heading3"/>
       </w:pPr>
       <w:r>
-        <w:t>Test Bartletta (jednorodnosc wariancji):</w:t>
+        <w:t>Test Bartletta (jednorodność wariancji):</w:t>
       </w:r>
     </w:p>
     <w:p>
       <w:r>
-        <w:t>- K-squared = 1.678, df = 3, p-value = 0.642</w:t>
+        <w:t>• K-squared = 1,678; df = 3; p-value = 0,642</w:t>
         <w:br/>
-        <w:t>- p &gt; 0.05, NIE odrzucamy H0 - wariancje sa jednorodne</w:t>
+        <w:t>• p &gt; 0,05, NIE odrzucamy H₀ – wariancje są jednorodne.</w:t>
         <w:br/>
-        <w:t>- Zalozenie homogenicznosci wariancji dla ANOVA jest spelnione</w:t>
+        <w:t>• Założenie homogeniczności wariancji dla ANOVA jest spełnione.</w:t>
       </w:r>
     </w:p>
     <w:p>
@@ -440,14 +438,14 @@
       <w:r>
         <w:t xml:space="preserve">             Df  Sum Sq  Mean Sq  F value   Pr(&gt;F)</w:t>
         <w:br/>
-        <w:t>country       3   121.7    40.57    9.016   2.7e-05 ***</w:t>
+        <w:t>country       3   121,7    40,57    9,016   2,7e-05 ***</w:t>
         <w:br/>
-        <w:t>Residuals    92   414.0     4.50</w:t>
+        <w:t>Residuals    92   414,0     4,50</w:t>
         <w:br/>
         <w:br/>
-        <w:t>p-value = 0.000027 &lt; 0.05, ODRZUCAMY H0</w:t>
+        <w:t>p-value = 0,000027 &lt; 0,05 – ODRZUCAMY H₀.</w:t>
         <w:br/>
-        <w:t>Istnieja statystycznie istotne roznice miedzy srednimi.</w:t>
+        <w:t>Istnieją statystycznie istotne różnice między średnimi.</w:t>
       </w:r>
     </w:p>
     <w:p>
@@ -460,19 +458,19 @@
     </w:p>
     <w:p>
       <w:r>
-        <w:t>Porownanie par krajow (roznica srednich, p adj):</w:t>
+        <w:t>Porównanie par krajów (różnica średnich; p adj):</w:t>
         <w:br/>
-        <w:t>- Japan - Germany:   diff = -0.447, p adj = 0.885 (nieistotne)</w:t>
+        <w:t>• Japan – Germany:   diff = −0,447; p adj = 0,885 (nieistotne)</w:t>
         <w:br/>
-        <w:t>- Poland - Germany:  diff = +2.486, p adj = 0.0006 (ISTOTNE ***)</w:t>
+        <w:t>• Poland – Germany:  diff = +2,486; p adj = 0,0006 (ISTOTNE ***)</w:t>
         <w:br/>
-        <w:t>- USA - Germany:     diff = +1.004, p adj = 0.362 (nieistotne)</w:t>
+        <w:t>• USA – Germany:     diff = +1,004; p adj = 0,362 (nieistotne)</w:t>
         <w:br/>
-        <w:t>- Poland - Japan:    diff = +2.932, p adj = 0.00004 (ISTOTNE ***)</w:t>
+        <w:t>• Poland – Japan:    diff = +2,932; p adj = 0,00004 (ISTOTNE ***)</w:t>
         <w:br/>
-        <w:t>- USA - Japan:       diff = +1.450, p adj = 0.090 (nieistotne, blisko granicy)</w:t>
+        <w:t>• USA – Japan:       diff = +1,450; p adj = 0,090 (nieistotne, bliskie granicy)</w:t>
         <w:br/>
-        <w:t>- USA - Poland:      diff = -1.482, p adj = 0.080 (nieistotne, blisko granicy)</w:t>
+        <w:t>• USA – Poland:      diff = −1,482; p adj = 0,080 (nieistotne, bliskie granicy)</w:t>
       </w:r>
     </w:p>
     <w:p>
@@ -485,17 +483,17 @@
     </w:p>
     <w:p>
       <w:r>
-        <w:t>Jednoczynnikowa analiza wariancji wykazala statystycznie istotne roznice w srednim rocznym tempie wzrostu PKB miedzy badanymi krajami (F = 9.016, p = 0.000027). Test post-hoc Tukeya pozwolil ustalac, ktore konkretnie pary krajow sie roznia:</w:t>
+        <w:t>Jednoczynnikowa analiza wariancji wykazała statystycznie istotne różnice w średnim rocznym tempie wzrostu PKB między badanymi krajami (F = 9,016; p = 0,000027). Test post-hoc Tukeya pozwolił ustalić, które konkretnie pary krajów się różnią:</w:t>
         <w:br/>
         <w:br/>
-        <w:t>- Polska ma istotnie wyzsze tempo wzrostu PKB niz Niemcy (roznica +2.49 pp, p = 0.0006) oraz Japonia (roznica +2.93 pp, p = 0.00004).</w:t>
+        <w:t>• Polska ma istotnie wyższe tempo wzrostu PKB niż Niemcy (różnica +2,49 pp; p = 0,0006) oraz Japonia (różnica +2,93 pp; p = 0,00004).</w:t>
         <w:br/>
-        <w:t>- Roznice USA-Japonia (p = 0.09) i USA-Polska (p = 0.08) sa bliskie granicy istotnosci, ale formalnie nieistotne przy alfa = 0.05.</w:t>
+        <w:t>• Różnice USA–Japonia (p = 0,09) i USA–Polska (p = 0,08) są bliskie granicy istotności, ale formalnie nieistotne przy α = 0,05.</w:t>
         <w:br/>
-        <w:t>- Niemcy i Japonia nie roznia sie istotnie (p = 0.885).</w:t>
+        <w:t>• Niemcy i Japonia nie różnią się istotnie (p = 0,885).</w:t>
         <w:br/>
         <w:br/>
-        <w:t>Wniosek ekonomiczny: Polska jako gospodarka rozwijajaca sie (emerging market) notuje statystycznie istotnie wyzsze tempo wzrostu PKB niz dojrzale gospodarki Niemiec i Japonii. Jest to zgodne z teoria konwergencji ekonomicznej, wedlug ktorej kraje o nizszym poczatkowym poziomie PKB per capita rosna szybciej. Test Kruskala-Wallisa (nieparametryczny) potwierdza te wyniki.</w:t>
+        <w:t>Wniosek ekonomiczny: Polska jako gospodarka rozwijająca się (emerging market) notuje statystycznie istotnie wyższe tempo wzrostu PKB niż dojrzałe gospodarki Niemiec i Japonii. Jest to zgodne z teorią konwergencji ekonomicznej, według której kraje o niższym początkowym poziomie PKB per capita rosną szybciej. Test Kruskala–Wallisa (nieparametryczny) potwierdza te wyniki.</w:t>
       </w:r>
     </w:p>
     <w:p>
@@ -508,7 +506,7 @@
         <w:pStyle w:val="Heading1"/>
       </w:pPr>
       <w:r>
-        <w:t>Zadanie 3: A/B Testing - proby zalezne (parowy test t)</w:t>
+        <w:t>Zadanie 3: A/B testing – próby zależne (parowy test t)</w:t>
       </w:r>
     </w:p>
     <w:p>
@@ -521,7 +519,7 @@
     </w:p>
     <w:p>
       <w:r>
-        <w:t>Badamy wplyw wprowadzenia Pracowniczych Planow Kapitalowych (PPK) na miesieczne stopy zwrotu indeksu WIG20. Dane obejmuja 30 sparowanych obserwacji miesiecznych: stopy zwrotu w tych samych miesiacach PRZED i PO wprowadzeniu PPK. Proby sa zalezne (sparowane), poniewaz porownujemy te same okresy kalendarzowe (np. styczen przed vs styczen po zdarzeniu). Dane symulowane z set.seed(67) dla powtarzalnosci.</w:t>
+        <w:t>Badamy wpływ wprowadzenia Pracowniczych Planów Kapitałowych (PPK) na miesięczne stopy zwrotu indeksu WIG20. Dane obejmują 30 sparowanych obserwacji miesięcznych: stopy zwrotu w tych samych miesiącach PRZED i PO wprowadzeniu PPK. Próby są zależne (sparowane), ponieważ porównujemy te same okresy kalendarzowe (np. styczeń przed vs. styczeń po zdarzeniu). Dane symulowane z set.seed(67) dla powtarzalności wyników.</w:t>
       </w:r>
     </w:p>
     <w:p>
@@ -534,15 +532,15 @@
     </w:p>
     <w:p>
       <w:r>
-        <w:t>Procedura A/B testingu dla prob zaleznych:</w:t>
+        <w:t>Procedura A/B testingu dla prób zależnych:</w:t>
         <w:br/>
-        <w:t>1. Obliczenie roznic (after - before) dla kazdej pary obserwacji</w:t>
+        <w:t>1. Obliczenie różnic (after – before) dla każdej pary obserwacji</w:t>
         <w:br/>
-        <w:t>2. Test normalnosci Lilliefors na roznicach</w:t>
+        <w:t>2. Test normalności Lilliefors na różnicach</w:t>
         <w:br/>
         <w:t>3. Parowy test t-Studenta (t.test z paired = TRUE)</w:t>
         <w:br/>
-        <w:t>4. Test nieparametryczny Wilcoxona dla prob zaleznych (wilcox.test z paired = TRUE)</w:t>
+        <w:t>4. Test nieparametryczny Wilcoxona dla prób zależnych (wilcox.test z paired = TRUE)</w:t>
       </w:r>
     </w:p>
     <w:p>
@@ -569,12 +567,12 @@
         <w:t>after_ppk &lt;- before_ppk + rnorm(n_obs, mean = 0.5, sd = 2.0)</w:t>
         <w:br/>
         <w:br/>
-        <w:t># Roznice</w:t>
+        <w:t># Różnice</w:t>
         <w:br/>
         <w:t>diff &lt;- after_ppk - before_ppk</w:t>
         <w:br/>
         <w:br/>
-        <w:t># Test normalnosci roznic</w:t>
+        <w:t># Test normalności różnic</w:t>
         <w:br/>
         <w:t>lillie.test(diff)</w:t>
         <w:br/>
@@ -594,7 +592,7 @@
         <w:pStyle w:val="Heading2"/>
       </w:pPr>
       <w:r>
-        <w:t>Wyniki testow</w:t>
+        <w:t>Wyniki testów</w:t>
       </w:r>
     </w:p>
     <w:p>
@@ -607,13 +605,13 @@
     </w:p>
     <w:p>
       <w:r>
-        <w:t>- Srednia stopa zwrotu PRZED PPK: -0.210%</w:t>
+        <w:t>• Średnia stopa zwrotu PRZED PPK: −0,210%</w:t>
         <w:br/>
-        <w:t>- Srednia stopa zwrotu PO PPK:    +0.091%</w:t>
+        <w:t>• Średnia stopa zwrotu PO PPK: +0,091%</w:t>
         <w:br/>
-        <w:t>- Srednia roznic (after - before): +0.300 pp</w:t>
+        <w:t>• Średnia różnic (after – before): +0,300 pp</w:t>
         <w:br/>
-        <w:t>- Liczba par obserwacji: n = 30</w:t>
+        <w:t>• Liczba par obserwacji: n = 30</w:t>
       </w:r>
     </w:p>
     <w:p>
@@ -621,16 +619,16 @@
         <w:pStyle w:val="Heading3"/>
       </w:pPr>
       <w:r>
-        <w:t>Test normalnosci Lilliefors (na roznicach):</w:t>
+        <w:t>Test normalności Lilliefors (na różnicach):</w:t>
       </w:r>
     </w:p>
     <w:p>
       <w:r>
-        <w:t>- D = 0.0857, p-value = 0.831</w:t>
+        <w:t>• D = 0,0857; p-value = 0,831</w:t>
         <w:br/>
-        <w:t>- p &gt; 0.05, NIE odrzucamy H0</w:t>
+        <w:t>• p &gt; 0,05, NIE odrzucamy H₀</w:t>
         <w:br/>
-        <w:t>- Roznice maja rozklad normalny - mozemy stosowac parowy test t</w:t>
+        <w:t>• Różnice mają rozkład normalny – możemy stosować parowy test t.</w:t>
       </w:r>
     </w:p>
     <w:p>
@@ -643,11 +641,11 @@
     </w:p>
     <w:p>
       <w:r>
-        <w:t>- t = 0.952, df = 29, p-value = 0.349</w:t>
+        <w:t>• t = 0,952; df = 29; p-value = 0,349</w:t>
         <w:br/>
-        <w:t>- Przedzial ufnosci 95% dla sredniej roznicy: (-0.345, 0.946)</w:t>
+        <w:t>• Przedział ufności 95% dla średniej różnicy: (−0,345; 0,946)</w:t>
         <w:br/>
-        <w:t>- p &gt; 0.05, NIE odrzucamy H0</w:t>
+        <w:t>• p &gt; 0,05, NIE odrzucamy H₀</w:t>
       </w:r>
     </w:p>
     <w:p>
@@ -660,11 +658,11 @@
     </w:p>
     <w:p>
       <w:r>
-        <w:t>- V = 288, p-value = 0.262</w:t>
+        <w:t>• V = 288; p-value = 0,262</w:t>
         <w:br/>
-        <w:t>- p &gt; 0.05, NIE odrzucamy H0</w:t>
+        <w:t>• p &gt; 0,05, NIE odrzucamy H₀</w:t>
         <w:br/>
-        <w:t>- Potwierdza wynik testu parametrycznego</w:t>
+        <w:t>• Potwierdza wynik testu parametrycznego.</w:t>
       </w:r>
     </w:p>
     <w:p>
@@ -677,13 +675,13 @@
     </w:p>
     <w:p>
       <w:r>
-        <w:t>Na poziomie istotnosci alfa = 0.05 nie stwierdzono statystycznie istotnego wplywu wprowadzenia PPK na miesieczne stopy zwrotu indeksu WIG20. Parowy test t-Studenta dal p-value = 0.349, a test Wilcoxona p = 0.262 - oba znacznie powyzej progu 0.05.</w:t>
+        <w:t>Na poziomie istotności α = 0,05 nie stwierdzono statystycznie istotnego wpływu wprowadzenia PPK na miesięczne stopy zwrotu indeksu WIG20. Parowy test t-Studenta dał p-value = 0,349, a test Wilcoxona p = 0,262 – oba znacznie powyżej progu 0,05.</w:t>
         <w:br/>
         <w:br/>
-        <w:t>Srednia roznica wynosi zaledwie +0.30 punktu procentowego (po PPK wyzsza niz przed), jednak przedzial ufnosci 95% obejmuje zero (-0.345 do +0.946), co oznacza, ze obserwowana roznica moze byc przypadkowa.</w:t>
+        <w:t>Średnia różnica wynosi zaledwie +0,30 punktu procentowego (po PPK wyższa niż przed), jednak przedział ufności 95% obejmuje zero (−0,345 do +0,946), co oznacza, że obserwowana różnica może być przypadkowa.</w:t>
         <w:br/>
         <w:br/>
-        <w:t>Zgodnosc wynikow testu parametrycznego (t-test) i nieparametrycznego (Wilcoxon) wzmacnia wniosek o braku istotnego efektu. Mozliwe przyczyny: (1) efekt PPK na rynek jest zbyt maly do wykrycia przy tej wielkosci proby (n=30), (2) dodatkowy kapital z PPK stanowi zbyt maly procent obrotow gieldowych, aby istotnie wplynac na indeks WIG20, (3) inne czynniki makroekonomiczne dominuja nad efektem PPK.</w:t>
+        <w:t>Zgodność wyników testu parametrycznego (t-test) i nieparametrycznego (Wilcoxon) wzmacnia wniosek o braku istotnego efektu. Możliwe przyczyny: (1) efekt PPK na rynek jest zbyt mały do wykrycia przy tej wielkości próby (n = 30); (2) dodatkowy kapitał z PPK stanowi zbyt mały procent obrotów giełdowych, aby istotnie wpłynąć na indeks WIG20; (3) inne czynniki makroekonomiczne dominują nad efektem PPK.</w:t>
       </w:r>
     </w:p>
     <w:sectPr>

</xml_diff>